<commit_message>
Initial commit: added folder structure and initial documentation
</commit_message>
<xml_diff>
--- a/docs/team_charter.docx
+++ b/docs/team_charter.docx
@@ -1,6 +1,6 @@
 
 <file path=word/document.xml><?xml version="1.0" encoding="utf-8"?>
-<w:document xmlns:wpc="http://schemas.microsoft.com/office/word/2010/wordprocessingCanvas" xmlns:cx="http://schemas.microsoft.com/office/drawing/2014/chartex" xmlns:cx1="http://schemas.microsoft.com/office/drawing/2015/9/8/chartex" xmlns:cx2="http://schemas.microsoft.com/office/drawing/2015/10/21/chartex" xmlns:cx3="http://schemas.microsoft.com/office/drawing/2016/5/9/chartex" xmlns:cx4="http://schemas.microsoft.com/office/drawing/2016/5/10/chartex" xmlns:cx5="http://schemas.microsoft.com/office/drawing/2016/5/11/chartex" xmlns:cx6="http://schemas.microsoft.com/office/drawing/2016/5/12/chartex" xmlns:cx7="http://schemas.microsoft.com/office/drawing/2016/5/13/chartex" xmlns:cx8="http://schemas.microsoft.com/office/drawing/2016/5/14/chartex" xmlns:mc="http://schemas.openxmlformats.org/markup-compatibility/2006" xmlns:aink="http://schemas.microsoft.com/office/drawing/2016/ink" xmlns:am3d="http://schemas.microsoft.com/office/drawing/2017/model3d" xmlns:o="urn:schemas-microsoft-com:office:office" xmlns:r="http://schemas.openxmlformats.org/officeDocument/2006/relationships" xmlns:m="http://schemas.openxmlformats.org/officeDocument/2006/math" xmlns:v="urn:schemas-microsoft-com:vml" xmlns:wp14="http://schemas.microsoft.com/office/word/2010/wordprocessingDrawing" xmlns:wp="http://schemas.openxmlformats.org/drawingml/2006/wordprocessingDrawing" xmlns:w10="urn:schemas-microsoft-com:office:word" xmlns:w="http://schemas.openxmlformats.org/wordprocessingml/2006/main" xmlns:w14="http://schemas.microsoft.com/office/word/2010/wordml" xmlns:w15="http://schemas.microsoft.com/office/word/2012/wordml" xmlns:w16cex="http://schemas.microsoft.com/office/word/2018/wordml/cex" xmlns:w16cid="http://schemas.microsoft.com/office/word/2016/wordml/cid" xmlns:w16="http://schemas.microsoft.com/office/word/2018/wordml" xmlns:w16sdtdh="http://schemas.microsoft.com/office/word/2020/wordml/sdtdatahash" xmlns:w16se="http://schemas.microsoft.com/office/word/2015/wordml/symex" xmlns:wpg="http://schemas.microsoft.com/office/word/2010/wordprocessingGroup" xmlns:wpi="http://schemas.microsoft.com/office/word/2010/wordprocessingInk" xmlns:wne="http://schemas.microsoft.com/office/word/2006/wordml" xmlns:wps="http://schemas.microsoft.com/office/word/2010/wordprocessingShape" mc:Ignorable="w14 w15 w16se w16cid w16 w16cex w16sdtdh wp14">
+<w:document xmlns:wpc="http://schemas.microsoft.com/office/word/2010/wordprocessingCanvas" xmlns:cx="http://schemas.microsoft.com/office/drawing/2014/chartex" xmlns:cx1="http://schemas.microsoft.com/office/drawing/2015/9/8/chartex" xmlns:cx2="http://schemas.microsoft.com/office/drawing/2015/10/21/chartex" xmlns:cx3="http://schemas.microsoft.com/office/drawing/2016/5/9/chartex" xmlns:cx4="http://schemas.microsoft.com/office/drawing/2016/5/10/chartex" xmlns:cx5="http://schemas.microsoft.com/office/drawing/2016/5/11/chartex" xmlns:cx6="http://schemas.microsoft.com/office/drawing/2016/5/12/chartex" xmlns:cx7="http://schemas.microsoft.com/office/drawing/2016/5/13/chartex" xmlns:cx8="http://schemas.microsoft.com/office/drawing/2016/5/14/chartex" xmlns:mc="http://schemas.openxmlformats.org/markup-compatibility/2006" xmlns:aink="http://schemas.microsoft.com/office/drawing/2016/ink" xmlns:am3d="http://schemas.microsoft.com/office/drawing/2017/model3d" xmlns:o="urn:schemas-microsoft-com:office:office" xmlns:oel="http://schemas.microsoft.com/office/2019/extlst" xmlns:r="http://schemas.openxmlformats.org/officeDocument/2006/relationships" xmlns:m="http://schemas.openxmlformats.org/officeDocument/2006/math" xmlns:v="urn:schemas-microsoft-com:vml" xmlns:wp14="http://schemas.microsoft.com/office/word/2010/wordprocessingDrawing" xmlns:wp="http://schemas.openxmlformats.org/drawingml/2006/wordprocessingDrawing" xmlns:w10="urn:schemas-microsoft-com:office:word" xmlns:w="http://schemas.openxmlformats.org/wordprocessingml/2006/main" xmlns:w14="http://schemas.microsoft.com/office/word/2010/wordml" xmlns:w15="http://schemas.microsoft.com/office/word/2012/wordml" xmlns:w16cex="http://schemas.microsoft.com/office/word/2018/wordml/cex" xmlns:w16cid="http://schemas.microsoft.com/office/word/2016/wordml/cid" xmlns:w16="http://schemas.microsoft.com/office/word/2018/wordml" xmlns:w16du="http://schemas.microsoft.com/office/word/2023/wordml/word16du" xmlns:w16sdtdh="http://schemas.microsoft.com/office/word/2020/wordml/sdtdatahash" xmlns:w16sdtfl="http://schemas.microsoft.com/office/word/2024/wordml/sdtformatlock" xmlns:w16se="http://schemas.microsoft.com/office/word/2015/wordml/symex" xmlns:wpg="http://schemas.microsoft.com/office/word/2010/wordprocessingGroup" xmlns:wpi="http://schemas.microsoft.com/office/word/2010/wordprocessingInk" xmlns:wne="http://schemas.microsoft.com/office/word/2006/wordml" xmlns:wps="http://schemas.microsoft.com/office/word/2010/wordprocessingShape" mc:Ignorable="w14 w15 w16se w16cid w16 w16cex w16sdtdh w16sdtfl w16du wp14">
   <w:body>
     <w:p>
       <w:pPr>
@@ -417,7 +417,7 @@
     </w:p>
     <w:tbl>
       <w:tblPr>
-        <w:tblW w:w="9360" w:type="dxa"/>
+        <w:tblW w:w="10369" w:type="dxa"/>
         <w:tblBorders>
           <w:top w:val="single" w:sz="4" w:space="0" w:color="auto"/>
           <w:left w:val="single" w:sz="4" w:space="0" w:color="auto"/>
@@ -433,15 +433,18 @@
         <w:tblLook w:val="04A0" w:firstRow="1" w:lastRow="0" w:firstColumn="1" w:lastColumn="0" w:noHBand="0" w:noVBand="1"/>
       </w:tblPr>
       <w:tblGrid>
-        <w:gridCol w:w="2383"/>
-        <w:gridCol w:w="2608"/>
-        <w:gridCol w:w="1702"/>
-        <w:gridCol w:w="2667"/>
+        <w:gridCol w:w="2640"/>
+        <w:gridCol w:w="2889"/>
+        <w:gridCol w:w="1885"/>
+        <w:gridCol w:w="2955"/>
       </w:tblGrid>
       <w:tr>
-        <w:tc>
-          <w:tcPr>
-            <w:tcW w:w="2672" w:type="dxa"/>
+        <w:trPr>
+          <w:trHeight w:val="237"/>
+        </w:trPr>
+        <w:tc>
+          <w:tcPr>
+            <w:tcW w:w="2640" w:type="dxa"/>
             <w:tcBorders>
               <w:top w:val="single" w:sz="1" w:space="0" w:color="AAAAAA"/>
               <w:left w:val="single" w:sz="1" w:space="0" w:color="AAAAAA"/>
@@ -468,7 +471,7 @@
         </w:tc>
         <w:tc>
           <w:tcPr>
-            <w:tcW w:w="2880" w:type="dxa"/>
+            <w:tcW w:w="2889" w:type="dxa"/>
             <w:tcBorders>
               <w:top w:val="single" w:sz="1" w:space="0" w:color="AAAAAA"/>
               <w:left w:val="single" w:sz="1" w:space="0" w:color="AAAAAA"/>
@@ -495,7 +498,7 @@
         </w:tc>
         <w:tc>
           <w:tcPr>
-            <w:tcW w:w="1763" w:type="dxa"/>
+            <w:tcW w:w="1885" w:type="dxa"/>
             <w:tcBorders>
               <w:top w:val="single" w:sz="1" w:space="0" w:color="AAAAAA"/>
               <w:left w:val="single" w:sz="1" w:space="0" w:color="AAAAAA"/>
@@ -522,7 +525,7 @@
         </w:tc>
         <w:tc>
           <w:tcPr>
-            <w:tcW w:w="2045" w:type="dxa"/>
+            <w:tcW w:w="2955" w:type="dxa"/>
             <w:tcBorders>
               <w:top w:val="single" w:sz="1" w:space="0" w:color="AAAAAA"/>
               <w:left w:val="single" w:sz="1" w:space="0" w:color="AAAAAA"/>
@@ -549,9 +552,12 @@
         </w:tc>
       </w:tr>
       <w:tr>
-        <w:tc>
-          <w:tcPr>
-            <w:tcW w:w="2672" w:type="dxa"/>
+        <w:trPr>
+          <w:trHeight w:val="237"/>
+        </w:trPr>
+        <w:tc>
+          <w:tcPr>
+            <w:tcW w:w="2640" w:type="dxa"/>
             <w:tcBorders>
               <w:top w:val="single" w:sz="1" w:space="0" w:color="AAAAAA"/>
               <w:left w:val="single" w:sz="1" w:space="0" w:color="AAAAAA"/>
@@ -581,7 +587,7 @@
         </w:tc>
         <w:tc>
           <w:tcPr>
-            <w:tcW w:w="2880" w:type="dxa"/>
+            <w:tcW w:w="2889" w:type="dxa"/>
             <w:tcBorders>
               <w:top w:val="single" w:sz="1" w:space="0" w:color="AAAAAA"/>
               <w:left w:val="single" w:sz="1" w:space="0" w:color="AAAAAA"/>
@@ -603,7 +609,7 @@
         </w:tc>
         <w:tc>
           <w:tcPr>
-            <w:tcW w:w="1763" w:type="dxa"/>
+            <w:tcW w:w="1885" w:type="dxa"/>
             <w:tcBorders>
               <w:top w:val="single" w:sz="1" w:space="0" w:color="AAAAAA"/>
               <w:left w:val="single" w:sz="1" w:space="0" w:color="AAAAAA"/>
@@ -639,7 +645,7 @@
         </w:tc>
         <w:tc>
           <w:tcPr>
-            <w:tcW w:w="2045" w:type="dxa"/>
+            <w:tcW w:w="2955" w:type="dxa"/>
             <w:tcBorders>
               <w:top w:val="single" w:sz="1" w:space="0" w:color="AAAAAA"/>
               <w:left w:val="single" w:sz="1" w:space="0" w:color="AAAAAA"/>
@@ -674,12 +680,14 @@
             <w:r>
               <w:t>@</w:t>
             </w:r>
+            <w:proofErr w:type="spellStart"/>
             <w:r>
               <w:rPr>
                 <w:lang w:val="en-US"/>
               </w:rPr>
               <w:t>umt</w:t>
             </w:r>
+            <w:proofErr w:type="spellEnd"/>
             <w:r>
               <w:t>.edu</w:t>
             </w:r>
@@ -693,9 +701,12 @@
         </w:tc>
       </w:tr>
       <w:tr>
-        <w:tc>
-          <w:tcPr>
-            <w:tcW w:w="2672" w:type="dxa"/>
+        <w:trPr>
+          <w:trHeight w:val="226"/>
+        </w:trPr>
+        <w:tc>
+          <w:tcPr>
+            <w:tcW w:w="2640" w:type="dxa"/>
             <w:tcBorders>
               <w:top w:val="single" w:sz="1" w:space="0" w:color="AAAAAA"/>
               <w:left w:val="single" w:sz="1" w:space="0" w:color="AAAAAA"/>
@@ -725,7 +736,7 @@
         </w:tc>
         <w:tc>
           <w:tcPr>
-            <w:tcW w:w="2880" w:type="dxa"/>
+            <w:tcW w:w="2889" w:type="dxa"/>
             <w:tcBorders>
               <w:top w:val="single" w:sz="1" w:space="0" w:color="AAAAAA"/>
               <w:left w:val="single" w:sz="1" w:space="0" w:color="AAAAAA"/>
@@ -747,7 +758,7 @@
         </w:tc>
         <w:tc>
           <w:tcPr>
-            <w:tcW w:w="1763" w:type="dxa"/>
+            <w:tcW w:w="1885" w:type="dxa"/>
             <w:tcBorders>
               <w:top w:val="single" w:sz="1" w:space="0" w:color="AAAAAA"/>
               <w:left w:val="single" w:sz="1" w:space="0" w:color="AAAAAA"/>
@@ -783,7 +794,7 @@
         </w:tc>
         <w:tc>
           <w:tcPr>
-            <w:tcW w:w="2045" w:type="dxa"/>
+            <w:tcW w:w="2955" w:type="dxa"/>
             <w:tcBorders>
               <w:top w:val="single" w:sz="1" w:space="0" w:color="AAAAAA"/>
               <w:left w:val="single" w:sz="1" w:space="0" w:color="AAAAAA"/>
@@ -813,12 +824,14 @@
             <w:r>
               <w:t>@</w:t>
             </w:r>
+            <w:proofErr w:type="spellStart"/>
             <w:r>
               <w:rPr>
                 <w:lang w:val="en-US"/>
               </w:rPr>
               <w:t>umt</w:t>
             </w:r>
+            <w:proofErr w:type="spellEnd"/>
             <w:r>
               <w:t>.edu</w:t>
             </w:r>
@@ -832,9 +845,12 @@
         </w:tc>
       </w:tr>
       <w:tr>
-        <w:tc>
-          <w:tcPr>
-            <w:tcW w:w="2672" w:type="dxa"/>
+        <w:trPr>
+          <w:trHeight w:val="237"/>
+        </w:trPr>
+        <w:tc>
+          <w:tcPr>
+            <w:tcW w:w="2640" w:type="dxa"/>
             <w:tcBorders>
               <w:top w:val="single" w:sz="1" w:space="0" w:color="AAAAAA"/>
               <w:left w:val="single" w:sz="1" w:space="0" w:color="AAAAAA"/>
@@ -864,7 +880,7 @@
         </w:tc>
         <w:tc>
           <w:tcPr>
-            <w:tcW w:w="2880" w:type="dxa"/>
+            <w:tcW w:w="2889" w:type="dxa"/>
             <w:tcBorders>
               <w:top w:val="single" w:sz="1" w:space="0" w:color="AAAAAA"/>
               <w:left w:val="single" w:sz="1" w:space="0" w:color="AAAAAA"/>
@@ -886,7 +902,7 @@
         </w:tc>
         <w:tc>
           <w:tcPr>
-            <w:tcW w:w="1763" w:type="dxa"/>
+            <w:tcW w:w="1885" w:type="dxa"/>
             <w:tcBorders>
               <w:top w:val="single" w:sz="1" w:space="0" w:color="AAAAAA"/>
               <w:left w:val="single" w:sz="1" w:space="0" w:color="AAAAAA"/>
@@ -916,7 +932,7 @@
         </w:tc>
         <w:tc>
           <w:tcPr>
-            <w:tcW w:w="2045" w:type="dxa"/>
+            <w:tcW w:w="2955" w:type="dxa"/>
             <w:tcBorders>
               <w:top w:val="single" w:sz="1" w:space="0" w:color="AAAAAA"/>
               <w:left w:val="single" w:sz="1" w:space="0" w:color="AAAAAA"/>
@@ -940,12 +956,14 @@
             <w:r>
               <w:t>@</w:t>
             </w:r>
+            <w:proofErr w:type="spellStart"/>
             <w:r>
               <w:rPr>
                 <w:lang w:val="en-US"/>
               </w:rPr>
               <w:t>umt</w:t>
             </w:r>
+            <w:proofErr w:type="spellEnd"/>
             <w:r>
               <w:t>.edu</w:t>
             </w:r>
@@ -959,9 +977,12 @@
         </w:tc>
       </w:tr>
       <w:tr>
-        <w:tc>
-          <w:tcPr>
-            <w:tcW w:w="2672" w:type="dxa"/>
+        <w:trPr>
+          <w:trHeight w:val="237"/>
+        </w:trPr>
+        <w:tc>
+          <w:tcPr>
+            <w:tcW w:w="2640" w:type="dxa"/>
             <w:tcBorders>
               <w:top w:val="single" w:sz="1" w:space="0" w:color="AAAAAA"/>
               <w:left w:val="single" w:sz="1" w:space="0" w:color="AAAAAA"/>
@@ -991,7 +1012,7 @@
         </w:tc>
         <w:tc>
           <w:tcPr>
-            <w:tcW w:w="2880" w:type="dxa"/>
+            <w:tcW w:w="2889" w:type="dxa"/>
             <w:tcBorders>
               <w:top w:val="single" w:sz="1" w:space="0" w:color="AAAAAA"/>
               <w:left w:val="single" w:sz="1" w:space="0" w:color="AAAAAA"/>
@@ -1013,7 +1034,7 @@
         </w:tc>
         <w:tc>
           <w:tcPr>
-            <w:tcW w:w="1763" w:type="dxa"/>
+            <w:tcW w:w="1885" w:type="dxa"/>
             <w:tcBorders>
               <w:top w:val="single" w:sz="1" w:space="0" w:color="AAAAAA"/>
               <w:left w:val="single" w:sz="1" w:space="0" w:color="AAAAAA"/>
@@ -1038,7 +1059,7 @@
         </w:tc>
         <w:tc>
           <w:tcPr>
-            <w:tcW w:w="2045" w:type="dxa"/>
+            <w:tcW w:w="2955" w:type="dxa"/>
             <w:tcBorders>
               <w:top w:val="single" w:sz="1" w:space="0" w:color="AAAAAA"/>
               <w:left w:val="single" w:sz="1" w:space="0" w:color="AAAAAA"/>
@@ -1062,12 +1083,14 @@
             <w:r>
               <w:t>@</w:t>
             </w:r>
+            <w:proofErr w:type="spellStart"/>
             <w:r>
               <w:rPr>
                 <w:lang w:val="en-US"/>
               </w:rPr>
               <w:t>umt</w:t>
             </w:r>
+            <w:proofErr w:type="spellEnd"/>
             <w:r>
               <w:t>.edu</w:t>
             </w:r>
@@ -1081,9 +1104,12 @@
         </w:tc>
       </w:tr>
       <w:tr>
-        <w:tc>
-          <w:tcPr>
-            <w:tcW w:w="2672" w:type="dxa"/>
+        <w:trPr>
+          <w:trHeight w:val="237"/>
+        </w:trPr>
+        <w:tc>
+          <w:tcPr>
+            <w:tcW w:w="2640" w:type="dxa"/>
             <w:tcBorders>
               <w:top w:val="single" w:sz="1" w:space="0" w:color="AAAAAA"/>
               <w:left w:val="single" w:sz="1" w:space="0" w:color="AAAAAA"/>
@@ -1113,7 +1139,7 @@
         </w:tc>
         <w:tc>
           <w:tcPr>
-            <w:tcW w:w="2880" w:type="dxa"/>
+            <w:tcW w:w="2889" w:type="dxa"/>
             <w:tcBorders>
               <w:top w:val="single" w:sz="1" w:space="0" w:color="AAAAAA"/>
               <w:left w:val="single" w:sz="1" w:space="0" w:color="AAAAAA"/>
@@ -1135,7 +1161,7 @@
         </w:tc>
         <w:tc>
           <w:tcPr>
-            <w:tcW w:w="1763" w:type="dxa"/>
+            <w:tcW w:w="1885" w:type="dxa"/>
             <w:tcBorders>
               <w:top w:val="single" w:sz="1" w:space="0" w:color="AAAAAA"/>
               <w:left w:val="single" w:sz="1" w:space="0" w:color="AAAAAA"/>
@@ -1160,7 +1186,7 @@
         </w:tc>
         <w:tc>
           <w:tcPr>
-            <w:tcW w:w="2045" w:type="dxa"/>
+            <w:tcW w:w="2955" w:type="dxa"/>
             <w:tcBorders>
               <w:top w:val="single" w:sz="1" w:space="0" w:color="AAAAAA"/>
               <w:left w:val="single" w:sz="1" w:space="0" w:color="AAAAAA"/>
@@ -1184,12 +1210,14 @@
             <w:r>
               <w:t>@</w:t>
             </w:r>
+            <w:proofErr w:type="spellStart"/>
             <w:r>
               <w:rPr>
                 <w:lang w:val="en-US"/>
               </w:rPr>
               <w:t>umt</w:t>
             </w:r>
+            <w:proofErr w:type="spellEnd"/>
             <w:r>
               <w:t>.edu</w:t>
             </w:r>
@@ -1203,9 +1231,12 @@
         </w:tc>
       </w:tr>
       <w:tr>
-        <w:tc>
-          <w:tcPr>
-            <w:tcW w:w="2672" w:type="dxa"/>
+        <w:trPr>
+          <w:trHeight w:val="226"/>
+        </w:trPr>
+        <w:tc>
+          <w:tcPr>
+            <w:tcW w:w="2640" w:type="dxa"/>
             <w:tcBorders>
               <w:top w:val="single" w:sz="1" w:space="0" w:color="AAAAAA"/>
               <w:left w:val="single" w:sz="1" w:space="0" w:color="AAAAAA"/>
@@ -1241,7 +1272,7 @@
         </w:tc>
         <w:tc>
           <w:tcPr>
-            <w:tcW w:w="2880" w:type="dxa"/>
+            <w:tcW w:w="2889" w:type="dxa"/>
             <w:tcBorders>
               <w:top w:val="single" w:sz="1" w:space="0" w:color="AAAAAA"/>
               <w:left w:val="single" w:sz="1" w:space="0" w:color="AAAAAA"/>
@@ -1263,7 +1294,7 @@
         </w:tc>
         <w:tc>
           <w:tcPr>
-            <w:tcW w:w="1763" w:type="dxa"/>
+            <w:tcW w:w="1885" w:type="dxa"/>
             <w:tcBorders>
               <w:top w:val="single" w:sz="1" w:space="0" w:color="AAAAAA"/>
               <w:left w:val="single" w:sz="1" w:space="0" w:color="AAAAAA"/>
@@ -1293,7 +1324,7 @@
         </w:tc>
         <w:tc>
           <w:tcPr>
-            <w:tcW w:w="2045" w:type="dxa"/>
+            <w:tcW w:w="2955" w:type="dxa"/>
             <w:tcBorders>
               <w:top w:val="single" w:sz="1" w:space="0" w:color="AAAAAA"/>
               <w:left w:val="single" w:sz="1" w:space="0" w:color="AAAAAA"/>
@@ -1317,12 +1348,14 @@
             <w:r>
               <w:t>@</w:t>
             </w:r>
+            <w:proofErr w:type="spellStart"/>
             <w:r>
               <w:rPr>
                 <w:lang w:val="en-US"/>
               </w:rPr>
               <w:t>umt</w:t>
             </w:r>
+            <w:proofErr w:type="spellEnd"/>
             <w:r>
               <w:t>.edu</w:t>
             </w:r>
@@ -2301,18 +2334,14 @@
           <w:p>
             <w:pPr>
               <w:rPr>
-                <w:rFonts w:ascii="Blackadder ITC" w:hAnsi="Blackadder ITC"/>
-                <w:b/>
-                <w:bCs/>
+                <w:rFonts w:ascii="Freestyle Script" w:hAnsi="Freestyle Script"/>
                 <w:sz w:val="32"/>
                 <w:szCs w:val="32"/>
               </w:rPr>
             </w:pPr>
             <w:r>
               <w:rPr>
-                <w:rFonts w:ascii="Blackadder ITC" w:hAnsi="Blackadder ITC"/>
-                <w:b/>
-                <w:bCs/>
+                <w:rFonts w:ascii="Freestyle Script" w:hAnsi="Freestyle Script"/>
                 <w:sz w:val="32"/>
                 <w:szCs w:val="32"/>
                 <w:lang w:val="en-US"/>
@@ -2392,18 +2421,14 @@
           <w:p>
             <w:pPr>
               <w:rPr>
-                <w:rFonts w:ascii="Blackadder ITC" w:hAnsi="Blackadder ITC"/>
-                <w:b/>
-                <w:bCs/>
+                <w:rFonts w:ascii="Freestyle Script" w:hAnsi="Freestyle Script"/>
                 <w:sz w:val="32"/>
                 <w:szCs w:val="32"/>
               </w:rPr>
             </w:pPr>
             <w:r>
               <w:rPr>
-                <w:rFonts w:ascii="Blackadder ITC" w:hAnsi="Blackadder ITC"/>
-                <w:b/>
-                <w:bCs/>
+                <w:rFonts w:ascii="Freestyle Script" w:hAnsi="Freestyle Script"/>
                 <w:sz w:val="32"/>
                 <w:szCs w:val="32"/>
                 <w:lang w:val="en-US"/>
@@ -2483,18 +2508,14 @@
           <w:p>
             <w:pPr>
               <w:rPr>
-                <w:rFonts w:ascii="Blackadder ITC" w:hAnsi="Blackadder ITC"/>
-                <w:b/>
-                <w:bCs/>
+                <w:rFonts w:ascii="Freestyle Script" w:hAnsi="Freestyle Script"/>
                 <w:sz w:val="32"/>
                 <w:szCs w:val="32"/>
               </w:rPr>
             </w:pPr>
             <w:r>
               <w:rPr>
-                <w:rFonts w:ascii="Blackadder ITC" w:hAnsi="Blackadder ITC"/>
-                <w:b/>
-                <w:bCs/>
+                <w:rFonts w:ascii="Freestyle Script" w:hAnsi="Freestyle Script"/>
                 <w:sz w:val="32"/>
                 <w:szCs w:val="32"/>
                 <w:lang w:val="en-US"/>
@@ -2574,18 +2595,14 @@
           <w:p>
             <w:pPr>
               <w:rPr>
-                <w:rFonts w:ascii="Blackadder ITC" w:hAnsi="Blackadder ITC"/>
-                <w:b/>
-                <w:bCs/>
+                <w:rFonts w:ascii="Freestyle Script" w:hAnsi="Freestyle Script"/>
                 <w:sz w:val="32"/>
                 <w:szCs w:val="32"/>
               </w:rPr>
             </w:pPr>
             <w:r>
               <w:rPr>
-                <w:rFonts w:ascii="Blackadder ITC" w:hAnsi="Blackadder ITC"/>
-                <w:b/>
-                <w:bCs/>
+                <w:rFonts w:ascii="Freestyle Script" w:hAnsi="Freestyle Script"/>
                 <w:sz w:val="32"/>
                 <w:szCs w:val="32"/>
                 <w:lang w:val="en-US"/>
@@ -2665,18 +2682,14 @@
           <w:p>
             <w:pPr>
               <w:rPr>
-                <w:rFonts w:ascii="Blackadder ITC" w:hAnsi="Blackadder ITC"/>
-                <w:b/>
-                <w:bCs/>
+                <w:rFonts w:ascii="Freestyle Script" w:hAnsi="Freestyle Script"/>
                 <w:sz w:val="32"/>
                 <w:szCs w:val="32"/>
               </w:rPr>
             </w:pPr>
             <w:r>
               <w:rPr>
-                <w:rFonts w:ascii="Blackadder ITC" w:hAnsi="Blackadder ITC"/>
-                <w:b/>
-                <w:bCs/>
+                <w:rFonts w:ascii="Freestyle Script" w:hAnsi="Freestyle Script"/>
                 <w:sz w:val="32"/>
                 <w:szCs w:val="32"/>
                 <w:lang w:val="en-US"/>
@@ -2756,18 +2769,14 @@
           <w:p>
             <w:pPr>
               <w:rPr>
-                <w:rFonts w:ascii="Blackadder ITC" w:hAnsi="Blackadder ITC"/>
-                <w:b/>
-                <w:bCs/>
+                <w:rFonts w:ascii="Freestyle Script" w:hAnsi="Freestyle Script"/>
                 <w:sz w:val="32"/>
                 <w:szCs w:val="32"/>
               </w:rPr>
             </w:pPr>
             <w:r>
               <w:rPr>
-                <w:rFonts w:ascii="Blackadder ITC" w:hAnsi="Blackadder ITC"/>
-                <w:b/>
-                <w:bCs/>
+                <w:rFonts w:ascii="Freestyle Script" w:hAnsi="Freestyle Script"/>
                 <w:sz w:val="32"/>
                 <w:szCs w:val="32"/>
                 <w:lang w:val="en-US"/>
@@ -2859,7 +2868,7 @@
 </file>
 
 <file path=word/numbering.xml><?xml version="1.0" encoding="utf-8"?>
-<w:numbering xmlns:wpc="http://schemas.microsoft.com/office/word/2010/wordprocessingCanvas" xmlns:cx="http://schemas.microsoft.com/office/drawing/2014/chartex" xmlns:cx1="http://schemas.microsoft.com/office/drawing/2015/9/8/chartex" xmlns:cx2="http://schemas.microsoft.com/office/drawing/2015/10/21/chartex" xmlns:cx3="http://schemas.microsoft.com/office/drawing/2016/5/9/chartex" xmlns:cx4="http://schemas.microsoft.com/office/drawing/2016/5/10/chartex" xmlns:cx5="http://schemas.microsoft.com/office/drawing/2016/5/11/chartex" xmlns:cx6="http://schemas.microsoft.com/office/drawing/2016/5/12/chartex" xmlns:cx7="http://schemas.microsoft.com/office/drawing/2016/5/13/chartex" xmlns:cx8="http://schemas.microsoft.com/office/drawing/2016/5/14/chartex" xmlns:mc="http://schemas.openxmlformats.org/markup-compatibility/2006" xmlns:aink="http://schemas.microsoft.com/office/drawing/2016/ink" xmlns:am3d="http://schemas.microsoft.com/office/drawing/2017/model3d" xmlns:o="urn:schemas-microsoft-com:office:office" xmlns:r="http://schemas.openxmlformats.org/officeDocument/2006/relationships" xmlns:m="http://schemas.openxmlformats.org/officeDocument/2006/math" xmlns:v="urn:schemas-microsoft-com:vml" xmlns:wp14="http://schemas.microsoft.com/office/word/2010/wordprocessingDrawing" xmlns:wp="http://schemas.openxmlformats.org/drawingml/2006/wordprocessingDrawing" xmlns:w10="urn:schemas-microsoft-com:office:word" xmlns:w="http://schemas.openxmlformats.org/wordprocessingml/2006/main" xmlns:w14="http://schemas.microsoft.com/office/word/2010/wordml" xmlns:w15="http://schemas.microsoft.com/office/word/2012/wordml" xmlns:w16cex="http://schemas.microsoft.com/office/word/2018/wordml/cex" xmlns:w16cid="http://schemas.microsoft.com/office/word/2016/wordml/cid" xmlns:w16="http://schemas.microsoft.com/office/word/2018/wordml" xmlns:w16sdtdh="http://schemas.microsoft.com/office/word/2020/wordml/sdtdatahash" xmlns:w16se="http://schemas.microsoft.com/office/word/2015/wordml/symex" xmlns:wpg="http://schemas.microsoft.com/office/word/2010/wordprocessingGroup" xmlns:wpi="http://schemas.microsoft.com/office/word/2010/wordprocessingInk" xmlns:wne="http://schemas.microsoft.com/office/word/2006/wordml" xmlns:wps="http://schemas.microsoft.com/office/word/2010/wordprocessingShape" mc:Ignorable="w14 w15 w16se w16cid w16 w16cex w16sdtdh wp14">
+<w:numbering xmlns:wpc="http://schemas.microsoft.com/office/word/2010/wordprocessingCanvas" xmlns:cx="http://schemas.microsoft.com/office/drawing/2014/chartex" xmlns:cx1="http://schemas.microsoft.com/office/drawing/2015/9/8/chartex" xmlns:cx2="http://schemas.microsoft.com/office/drawing/2015/10/21/chartex" xmlns:cx3="http://schemas.microsoft.com/office/drawing/2016/5/9/chartex" xmlns:cx4="http://schemas.microsoft.com/office/drawing/2016/5/10/chartex" xmlns:cx5="http://schemas.microsoft.com/office/drawing/2016/5/11/chartex" xmlns:cx6="http://schemas.microsoft.com/office/drawing/2016/5/12/chartex" xmlns:cx7="http://schemas.microsoft.com/office/drawing/2016/5/13/chartex" xmlns:cx8="http://schemas.microsoft.com/office/drawing/2016/5/14/chartex" xmlns:mc="http://schemas.openxmlformats.org/markup-compatibility/2006" xmlns:aink="http://schemas.microsoft.com/office/drawing/2016/ink" xmlns:am3d="http://schemas.microsoft.com/office/drawing/2017/model3d" xmlns:o="urn:schemas-microsoft-com:office:office" xmlns:oel="http://schemas.microsoft.com/office/2019/extlst" xmlns:r="http://schemas.openxmlformats.org/officeDocument/2006/relationships" xmlns:m="http://schemas.openxmlformats.org/officeDocument/2006/math" xmlns:v="urn:schemas-microsoft-com:vml" xmlns:wp14="http://schemas.microsoft.com/office/word/2010/wordprocessingDrawing" xmlns:wp="http://schemas.openxmlformats.org/drawingml/2006/wordprocessingDrawing" xmlns:w10="urn:schemas-microsoft-com:office:word" xmlns:w="http://schemas.openxmlformats.org/wordprocessingml/2006/main" xmlns:w14="http://schemas.microsoft.com/office/word/2010/wordml" xmlns:w15="http://schemas.microsoft.com/office/word/2012/wordml" xmlns:w16cex="http://schemas.microsoft.com/office/word/2018/wordml/cex" xmlns:w16cid="http://schemas.microsoft.com/office/word/2016/wordml/cid" xmlns:w16="http://schemas.microsoft.com/office/word/2018/wordml" xmlns:w16du="http://schemas.microsoft.com/office/word/2023/wordml/word16du" xmlns:w16sdtdh="http://schemas.microsoft.com/office/word/2020/wordml/sdtdatahash" xmlns:w16sdtfl="http://schemas.microsoft.com/office/word/2024/wordml/sdtformatlock" xmlns:w16se="http://schemas.microsoft.com/office/word/2015/wordml/symex" xmlns:wpg="http://schemas.microsoft.com/office/word/2010/wordprocessingGroup" xmlns:wpi="http://schemas.microsoft.com/office/word/2010/wordprocessingInk" xmlns:wne="http://schemas.microsoft.com/office/word/2006/wordml" xmlns:wps="http://schemas.microsoft.com/office/word/2010/wordprocessingShape" mc:Ignorable="w14 w15 w16se w16cid w16 w16cex w16sdtdh w16sdtfl w16du wp14">
   <w:abstractNum w:abstractNumId="0" w15:restartNumberingAfterBreak="0">
     <w:nsid w:val="12503DC4"/>
     <w:multiLevelType w:val="hybridMultilevel"/>
@@ -3619,49 +3628,49 @@
       </w:pPr>
     </w:lvl>
   </w:abstractNum>
-  <w:num w:numId="1">
+  <w:num w:numId="1" w16cid:durableId="983584543">
     <w:abstractNumId w:val="7"/>
     <w:lvlOverride w:ilvl="0">
       <w:startOverride w:val="1"/>
     </w:lvlOverride>
   </w:num>
-  <w:num w:numId="2">
+  <w:num w:numId="2" w16cid:durableId="426193909">
     <w:abstractNumId w:val="1"/>
     <w:lvlOverride w:ilvl="0">
       <w:startOverride w:val="1"/>
     </w:lvlOverride>
   </w:num>
-  <w:num w:numId="3">
+  <w:num w:numId="3" w16cid:durableId="427192631">
     <w:abstractNumId w:val="5"/>
     <w:lvlOverride w:ilvl="0">
       <w:startOverride w:val="1"/>
     </w:lvlOverride>
   </w:num>
-  <w:num w:numId="4">
+  <w:num w:numId="4" w16cid:durableId="1014651551">
     <w:abstractNumId w:val="0"/>
   </w:num>
-  <w:num w:numId="5">
+  <w:num w:numId="5" w16cid:durableId="862207151">
     <w:abstractNumId w:val="6"/>
   </w:num>
-  <w:num w:numId="6">
+  <w:num w:numId="6" w16cid:durableId="719793499">
     <w:abstractNumId w:val="4"/>
   </w:num>
-  <w:num w:numId="7">
+  <w:num w:numId="7" w16cid:durableId="203294960">
     <w:abstractNumId w:val="3"/>
   </w:num>
-  <w:num w:numId="8">
+  <w:num w:numId="8" w16cid:durableId="1065254313">
     <w:abstractNumId w:val="2"/>
   </w:num>
 </w:numbering>
 </file>
 
 <file path=word/styles.xml><?xml version="1.0" encoding="utf-8"?>
-<w:styles xmlns:mc="http://schemas.openxmlformats.org/markup-compatibility/2006" xmlns:r="http://schemas.openxmlformats.org/officeDocument/2006/relationships" xmlns:w="http://schemas.openxmlformats.org/wordprocessingml/2006/main" xmlns:w14="http://schemas.microsoft.com/office/word/2010/wordml" xmlns:w15="http://schemas.microsoft.com/office/word/2012/wordml" xmlns:w16cex="http://schemas.microsoft.com/office/word/2018/wordml/cex" xmlns:w16cid="http://schemas.microsoft.com/office/word/2016/wordml/cid" xmlns:w16="http://schemas.microsoft.com/office/word/2018/wordml" xmlns:w16sdtdh="http://schemas.microsoft.com/office/word/2020/wordml/sdtdatahash" xmlns:w16se="http://schemas.microsoft.com/office/word/2015/wordml/symex" mc:Ignorable="w14 w15 w16se w16cid w16 w16cex w16sdtdh">
+<w:styles xmlns:mc="http://schemas.openxmlformats.org/markup-compatibility/2006" xmlns:r="http://schemas.openxmlformats.org/officeDocument/2006/relationships" xmlns:w="http://schemas.openxmlformats.org/wordprocessingml/2006/main" xmlns:w14="http://schemas.microsoft.com/office/word/2010/wordml" xmlns:w15="http://schemas.microsoft.com/office/word/2012/wordml" xmlns:w16cex="http://schemas.microsoft.com/office/word/2018/wordml/cex" xmlns:w16cid="http://schemas.microsoft.com/office/word/2016/wordml/cid" xmlns:w16="http://schemas.microsoft.com/office/word/2018/wordml" xmlns:w16du="http://schemas.microsoft.com/office/word/2023/wordml/word16du" xmlns:w16sdtdh="http://schemas.microsoft.com/office/word/2020/wordml/sdtdatahash" xmlns:w16sdtfl="http://schemas.microsoft.com/office/word/2024/wordml/sdtformatlock" xmlns:w16se="http://schemas.microsoft.com/office/word/2015/wordml/symex" mc:Ignorable="w14 w15 w16se w16cid w16 w16cex w16sdtdh w16sdtfl w16du">
   <w:docDefaults>
     <w:rPrDefault>
       <w:rPr>
         <w:rFonts w:ascii="Arial" w:eastAsia="Arial" w:hAnsi="Arial" w:cs="Arial"/>
-        <w:lang w:val="en-PK" w:eastAsia="en-PK" w:bidi="ar-SA"/>
+        <w:lang w:bidi="ar-SA"/>
       </w:rPr>
     </w:rPrDefault>
     <w:pPrDefault/>

</xml_diff>